<commit_message>
Point code citation at the updated Zenodo code-record version
</commit_message>
<xml_diff>
--- a/manuscript/Lunar_Shield_ISRU_Manuscript.docx
+++ b/manuscript/Lunar_Shield_ISRU_Manuscript.docx
@@ -6020,7 +6020,7 @@
         <w:jc w:val="both"/>
       </w:pPr>
       <w:r>
-        <w:t>The relativistic Boris-pusher simulation code, geometry builders, and validation/parameter-sweep code underlying the SEP-attenuation physics of Sections 3–7 are openly available, without access restriction, at https://github.com/sandlerleon/magdome (MIT license) and are archived at the specific version cited here on Zenodo (Sandler, 2026a; https://doi.org/10.5281/zenodo.21179710, MIT license), and are cited in text at each point where they underpin a quantitative claim in Sections 3–7, consistent with AGU's data and software availability policy. The permanent-magnet feasibility calculation, engineering mass-budget Monte Carlo, ISRU allocation and regolith-multiplier sweep, and CSDA energy-fluence model underlying Sections 7–10 and their associated tables are openly available, without access restriction, at https://github.com/sandlerleon/lunar-isru-magnetic-shield-mass (MIT license) and are archived at the specific version cited here on Zenodo (Sandler, 2026b; https://doi.org/10.5281/zenodo.22103955, MIT license), including a machine-readable results file (mass_isru_results.json) reproducing every quantitative figure in Sections 7–10. The first-order engineering feasibility estimates introduced in Section 11 of this revision are hand calculations reproduced in full in the text and tables of that section and do not require a separate code archive.</w:t>
+        <w:t>The relativistic Boris-pusher simulation code, geometry builders, and validation/parameter-sweep code underlying the SEP-attenuation physics of Sections 3–7 are openly available, without access restriction, at https://github.com/sandlerleon/magdome (MIT license) and are archived at the specific version cited here on Zenodo (Sandler, 2026a; https://doi.org/10.5281/zenodo.21179710, MIT license), and are cited in text at each point where they underpin a quantitative claim in Sections 3–7, consistent with AGU's data and software availability policy. The permanent-magnet feasibility calculation, engineering mass-budget Monte Carlo, ISRU allocation and regolith-multiplier sweep, and CSDA energy-fluence model underlying Sections 7–10 and their associated tables are openly available, without access restriction, at https://github.com/sandlerleon/lunar-isru-magnetic-shield-mass (MIT license) and are archived at the specific version cited here on Zenodo (Sandler, 2026b; https://doi.org/10.5281/zenodo.22547289, MIT license), including a machine-readable results file (mass_isru_results.json) reproducing every quantitative figure in Sections 7–10. The first-order engineering feasibility estimates introduced in Section 11 of this revision are hand calculations reproduced in full in the text and tables of that section and do not require a separate code archive.</w:t>
       </w:r>
     </w:p>
     <w:p>
@@ -6246,12 +6246,7 @@
         <w:ind w:left="431" w:hanging="431"/>
       </w:pPr>
       <w:r>
-        <w:rPr>
-          <w:rFonts w:ascii="Times New Roman" w:cs="Times New Roman" w:eastAsia="Times New Roman" w:hAnsi="Times New Roman"/>
-          <w:sz w:val="20"/>
-          <w:szCs w:val="20"/>
-        </w:rPr>
-        <w:t xml:space="preserve">Sandler, L. (2026b). Lunar ISRU Magnetic Shield Mass and Feasibility Analysis [Data set and code]. Zenodo. https://doi.org/10.5281/zenodo.22103955</w:t>
+        <w:t>Sandler, L. (2026b). Lunar ISRU Magnetic Shield Mass and Feasibility Analysis [Data set and code]. Zenodo. https://doi.org/10.5281/zenodo.22547289</w:t>
       </w:r>
     </w:p>
     <w:p>

</xml_diff>

<commit_message>
Point code citation at Zenodo code record including the figure-generation script
</commit_message>
<xml_diff>
--- a/manuscript/Lunar_Shield_ISRU_Manuscript.docx
+++ b/manuscript/Lunar_Shield_ISRU_Manuscript.docx
@@ -6293,7 +6293,7 @@
         <w:jc w:val="both"/>
       </w:pPr>
       <w:r>
-        <w:t>The relativistic Boris-pusher simulation code, geometry builders, and validation/parameter-sweep code underlying the SEP-attenuation physics of Sections 3–7 are openly available, without access restriction, at https://github.com/sandlerleon/magdome (MIT license) and are archived at the specific version cited here on Zenodo (Sandler, 2026a; https://doi.org/10.5281/zenodo.21179710, MIT license), and are cited in text at each point where they underpin a quantitative claim in Sections 3–7, consistent with AGU's data and software availability policy. The permanent-magnet feasibility calculation, engineering mass-budget Monte Carlo, ISRU allocation and regolith-multiplier sweep, and CSDA energy-fluence model underlying Sections 7–10 and their associated tables are openly available, without access restriction, at https://github.com/sandlerleon/lunar-isru-magnetic-shield-mass (MIT license) and are archived at the specific version cited here on Zenodo (Sandler, 2026b; https://doi.org/10.5281/zenodo.22547289, MIT license), including a machine-readable results file (mass_isru_results.json) reproducing every quantitative figure in Sections 7–10. The first-order engineering feasibility estimates in Section 11 are hand calculations reproduced in full in the text and tables of that section and do not require a separate code archive.</w:t>
+        <w:t>The relativistic Boris-pusher simulation code, geometry builders, and validation/parameter-sweep code underlying the SEP-attenuation physics of Sections 3–7 are openly available, without access restriction, at https://github.com/sandlerleon/magdome (MIT license) and are archived at the specific version cited here on Zenodo (Sandler, 2026a; https://doi.org/10.5281/zenodo.21179710, MIT license), and are cited in text at each point where they underpin a quantitative claim in Sections 3–7, consistent with AGU's data and software availability policy. The permanent-magnet feasibility calculation, engineering mass-budget Monte Carlo, ISRU allocation and regolith-multiplier sweep, and CSDA energy-fluence model underlying Sections 7–10 and their associated tables are openly available, without access restriction, at https://github.com/sandlerleon/lunar-isru-magnetic-shield-mass (MIT license) and are archived at the specific version cited here on Zenodo (Sandler, 2026b; https://doi.org/10.5281/zenodo.22548034, MIT license), including a machine-readable results file (mass_isru_results.json) reproducing every quantitative figure in Sections 7–10. The first-order engineering feasibility estimates in Section 11 are hand calculations reproduced in full in the text and tables of that section and do not require a separate code archive.</w:t>
       </w:r>
     </w:p>
     <w:p>
@@ -6519,7 +6519,7 @@
         <w:ind w:left="431" w:hanging="431"/>
       </w:pPr>
       <w:r>
-        <w:t>Sandler, L. (2026b). Lunar ISRU Magnetic Shield Mass and Feasibility Analysis [Data set and code]. Zenodo. https://doi.org/10.5281/zenodo.22547289</w:t>
+        <w:t>Sandler, L. (2026b). Lunar ISRU Magnetic Shield Mass and Feasibility Analysis [Data set and code]. Zenodo. https://doi.org/10.5281/zenodo.22548034</w:t>
       </w:r>
     </w:p>
     <w:p>

</xml_diff>